<commit_message>
fix: rebuild pdfs and webps
We've just installed linux libertine font, so rebuild pdf
</commit_message>
<xml_diff>
--- a/public/gallery/examples/account-executive/de/resume.docx
+++ b/public/gallery/examples/account-executive/de/resume.docx
@@ -66,7 +66,7 @@
         </w:rPr>
         <w:t xml:space="preserve">📧 </w:t>
       </w:r>
-      <w:hyperlink w:history="1" r:id="rIdn_qyodh_cx_8qsbhvb9er">
+      <w:hyperlink w:history="1" r:id="rIdy3jhwvw9garwui09vpedn">
         <w:r>
           <w:rPr>
             <w:sz w:val="18"/>
@@ -89,7 +89,7 @@
         </w:rPr>
         <w:t xml:space="preserve">🔗 </w:t>
       </w:r>
-      <w:hyperlink w:history="1" r:id="rIdcehxkn2zkozl28xywvhds">
+      <w:hyperlink w:history="1" r:id="rIdnly-ifmkizukdlbqwbhmf">
         <w:r>
           <w:rPr>
             <w:sz w:val="18"/>
@@ -124,7 +124,7 @@
         <w:spacing w:after="200" w:line="276"/>
         <w:jc w:val="center"/>
       </w:pPr>
-      <w:hyperlink w:history="1" r:id="rIdghbn9nnk9ld8beodtaytk">
+      <w:hyperlink w:history="1" r:id="rIdzno4-eazzkan3s25yi5o-">
         <w:r>
           <w:rPr>
             <w:sz w:val="18"/>
@@ -140,7 +140,7 @@
         </w:rPr>
         <w:t xml:space="preserve"> • </w:t>
       </w:r>
-      <w:hyperlink w:history="1" r:id="rIdrgojisim4n8iceh-widt1">
+      <w:hyperlink w:history="1" r:id="rIdv2wk8i0mcws1v7qwn7hgq">
         <w:r>
           <w:rPr>
             <w:sz w:val="18"/>
@@ -306,7 +306,7 @@
         </w:rPr>
         <w:t xml:space="preserve">	</w:t>
       </w:r>
-      <w:hyperlink w:history="1" r:id="rIddlif6uihs4d09jswsd9ga">
+      <w:hyperlink w:history="1" r:id="rId4580u5w0hcxurzbrlxsrb">
         <w:r>
           <w:rPr>
             <w:sz w:val="18"/>
@@ -450,7 +450,7 @@
         </w:rPr>
         <w:t xml:space="preserve">	</w:t>
       </w:r>
-      <w:hyperlink w:history="1" r:id="rIdnb8wumdyxm_rv727h5mz5">
+      <w:hyperlink w:history="1" r:id="rIddd_vcqmuadt4wg7pqgrl5">
         <w:r>
           <w:rPr>
             <w:sz w:val="18"/>
@@ -613,7 +613,7 @@
         </w:rPr>
         <w:t xml:space="preserve">	</w:t>
       </w:r>
-      <w:hyperlink w:history="1" r:id="rIdkg-scewkb76sjw9470u1m">
+      <w:hyperlink w:history="1" r:id="rIdcr8epclhid2_wrdaul-6_">
         <w:r>
           <w:rPr>
             <w:sz w:val="18"/>
@@ -795,7 +795,7 @@
         </w:rPr>
         <w:t xml:space="preserve">	</w:t>
       </w:r>
-      <w:hyperlink w:history="1" r:id="rId9lciod5ee2k1plhm8vc_u">
+      <w:hyperlink w:history="1" r:id="rIdbpm8vnen7buh5pqxpqbtm">
         <w:r>
           <w:rPr>
             <w:sz w:val="18"/>
@@ -977,7 +977,7 @@
         </w:rPr>
         <w:t xml:space="preserve">	</w:t>
       </w:r>
-      <w:hyperlink w:history="1" r:id="rIdviyxodlsnd2mnrlvno5aq">
+      <w:hyperlink w:history="1" r:id="rIdyxaphje1odb_ry9zpqetf">
         <w:r>
           <w:rPr>
             <w:sz w:val="18"/>
@@ -1497,7 +1497,7 @@
         </w:rPr>
         <w:t xml:space="preserve">	</w:t>
       </w:r>
-      <w:hyperlink w:history="1" r:id="rId6pnh9npphlra0qoj9icza">
+      <w:hyperlink w:history="1" r:id="rIdcfrdmt82enqleptzdyqnu">
         <w:r>
           <w:rPr>
             <w:sz w:val="18"/>
@@ -1563,7 +1563,7 @@
         </w:rPr>
         <w:t xml:space="preserve">	</w:t>
       </w:r>
-      <w:hyperlink w:history="1" r:id="rIdvxe8ncpoleljg8urth4qg">
+      <w:hyperlink w:history="1" r:id="rIdsjecw_8b4xl8tgw2rkdgt">
         <w:r>
           <w:rPr>
             <w:sz w:val="18"/>
@@ -1648,7 +1648,7 @@
         </w:rPr>
         <w:t xml:space="preserve">	</w:t>
       </w:r>
-      <w:hyperlink w:history="1" r:id="rIdo7hyeatbqckfeuvyomd5t">
+      <w:hyperlink w:history="1" r:id="rIdhyyw9cgw9zmsbwtsixi4g">
         <w:r>
           <w:rPr>
             <w:sz w:val="18"/>
@@ -1771,7 +1771,7 @@
         </w:rPr>
         <w:t xml:space="preserve">	</w:t>
       </w:r>
-      <w:hyperlink w:history="1" r:id="rIdq87i1_pyk_fqc4anp_z4d">
+      <w:hyperlink w:history="1" r:id="rIdwolkdzaaxm0rzfl1mvk0s">
         <w:r>
           <w:rPr>
             <w:sz w:val="18"/>
@@ -2016,7 +2016,7 @@
         </w:rPr>
         <w:t xml:space="preserve">	</w:t>
       </w:r>
-      <w:hyperlink w:history="1" r:id="rIdgponc2x6u7c0omrmhradf">
+      <w:hyperlink w:history="1" r:id="rIdoklxeygd6zq6mwsvs_ip7">
         <w:r>
           <w:rPr>
             <w:sz w:val="18"/>

</xml_diff>